<commit_message>
Add chapter two conclusion
Co-authored-by: Dmitry <Enotfttp@users.noreply.github.com>
</commit_message>
<xml_diff>
--- a/src/Diplom_Tezyaeva_T_Yu.docx
+++ b/src/Diplom_Tezyaeva_T_Yu.docx
@@ -30371,27 +30371,93 @@
     </w:p>
     <w:p>
       <w:pPr>
-        <w:rPr>
-          <w:rFonts w:hint="default" w:ascii="Times New Roman" w:hAnsi="Times New Roman"/>
-          <w:b/>
-          <w:bCs/>
-          <w:sz w:val="28"/>
-          <w:szCs w:val="28"/>
-          <w:vertAlign w:val="baseline"/>
-          <w:lang w:val="ru-RU"/>
-        </w:rPr>
-      </w:pPr>
-      <w:r>
-        <w:rPr>
-          <w:rFonts w:hint="default" w:ascii="Times New Roman" w:hAnsi="Times New Roman"/>
-          <w:b/>
-          <w:bCs/>
-          <w:sz w:val="28"/>
-          <w:szCs w:val="28"/>
-          <w:vertAlign w:val="baseline"/>
-          <w:lang w:val="ru-RU"/>
-        </w:rPr>
-        <w:br w:type="page"/>
+        <w:spacing w:line="360" w:lineRule="auto" w:after="120"/>
+        <w:ind w:firstLine="700"/>
+      </w:pPr>
+      <w:r>
+        <w:rPr>
+          <w:rFonts w:ascii="Times New Roman" w:hAnsi="Times New Roman"/>
+          <w:sz w:val="28"/>
+        </w:rPr>
+        <w:t>Во второй главе был проведен анализ системы обучения и развития тендерных специалистов ООО «Лайф Медиа» с учетом организационно-экономических особенностей предприятия, структуры персонала, результатов закупочной деятельности и мнения сотрудников тендерного отдела. Анализ показал, что компания относится к малому бизнесу, работает преимущественно в удаленном формате и получает основную часть выручки за счет участия в государственных и корпоративных закупках. Следовательно, качество работы тендерного отдела является одним из ключевых факторов финансовой устойчивости предприятия.</w:t>
+      </w:r>
+    </w:p>
+    <w:p>
+      <w:pPr>
+        <w:spacing w:line="360" w:lineRule="auto" w:after="120"/>
+        <w:ind w:firstLine="700"/>
+      </w:pPr>
+      <w:r>
+        <w:rPr>
+          <w:rFonts w:ascii="Times New Roman" w:hAnsi="Times New Roman"/>
+          <w:sz w:val="28"/>
+        </w:rPr>
+        <w:t>Изучение организационной структуры показало, что тендерный отдел является центральным подразделением компании: в нем занято 8 специалистов из 17 сотрудников. При этом система управления персоналом носит распределенный характер: отдельной HR-службы нет, кадровые функции выполняют генеральный директор, руководитель тендерного отдела и бухгалтерия. Такая модель соответствует масштабу предприятия, однако ограничивает возможности системной адаптации, обучения и развития персонала. Особенно значимым является то, что 62,5% специалистов тендерного отдела работают в компании менее одного года, а опыт более двух лет имеют только 25% сотрудников. Это указывает на недостаток устойчивого профессионального ядра и повышает зависимость качества работы от передачи опыта внутри отдела.</w:t>
+      </w:r>
+    </w:p>
+    <w:p>
+      <w:pPr>
+        <w:spacing w:line="360" w:lineRule="auto" w:after="120"/>
+        <w:ind w:firstLine="700"/>
+      </w:pPr>
+      <w:r>
+        <w:rPr>
+          <w:rFonts w:ascii="Times New Roman" w:hAnsi="Times New Roman"/>
+          <w:sz w:val="28"/>
+        </w:rPr>
+        <w:t>Анализ движения кадров выявил высокий уровень текучести: в 2024-2025 гг. коэффициент текучести в тендерном отделе составил 37,5%. При такой динамике компания вынуждена регулярно принимать новых сотрудников, но при этом не имеет формализованной программы адаптации. В результате новые работники осваивают обязанности через устные пояснения, самостоятельный поиск информации и помощь коллег. Такой подход позволяет решать текущие задачи, но не обеспечивает единых стандартов подготовки заявок и не снижает риск повторения ошибок.</w:t>
+      </w:r>
+    </w:p>
+    <w:p>
+      <w:pPr>
+        <w:spacing w:line="360" w:lineRule="auto" w:after="120"/>
+        <w:ind w:firstLine="700"/>
+      </w:pPr>
+      <w:r>
+        <w:rPr>
+          <w:rFonts w:ascii="Times New Roman" w:hAnsi="Times New Roman"/>
+          <w:sz w:val="28"/>
+        </w:rPr>
+        <w:t>Отдельное внимание было уделено мотивации и затратам на персонал. Установлено, что тендерные специалисты имеют наиболее высокий уровень выплат среди подразделений, а общие затраты на персонал составляют значительную долю выручки компании. Однако расходы на обучение остаются минимальными и составляют только 45 тыс. руб. в год. Эти средства используются эпизодически, главным образом на отдельные вебинары и записи по изменениям законодательства, поэтому не формируют полноценную систему развития компетенций. При этом действующая мотивация ориентирована преимущественно на результат, но не связывает премирование с обучением, наставничеством, обновлением базы знаний и качеством подготовки документов.</w:t>
+      </w:r>
+    </w:p>
+    <w:p>
+      <w:pPr>
+        <w:spacing w:line="360" w:lineRule="auto" w:after="120"/>
+        <w:ind w:firstLine="700"/>
+      </w:pPr>
+      <w:r>
+        <w:rPr>
+          <w:rFonts w:ascii="Times New Roman" w:hAnsi="Times New Roman"/>
+          <w:sz w:val="28"/>
+        </w:rPr>
+        <w:t>Оценка эффективности текущей системы обучения показала, что в ООО «Лайф Медиа» отсутствуют ключевые элементы управляемого образовательного процесса: программа адаптации, единая база актуальных шаблонов и инструкций, регулярная проверка знаний, системный разбор ошибок, формализованное наставничество и оценка влияния обучения на результаты закупочной деятельности. Это подтверждается не только анализом документов, но и результатами опроса сотрудников. Все 8 специалистов указали на отсутствие утвержденной программы обучения, большинство отметили разрозненность материалов, неуверенность в актуальности шаблонов и нехватку разбора реальных ошибок отдела.</w:t>
+      </w:r>
+    </w:p>
+    <w:p>
+      <w:pPr>
+        <w:spacing w:line="360" w:lineRule="auto" w:after="120"/>
+        <w:ind w:firstLine="700"/>
+      </w:pPr>
+      <w:r>
+        <w:rPr>
+          <w:rFonts w:ascii="Times New Roman" w:hAnsi="Times New Roman"/>
+          <w:sz w:val="28"/>
+        </w:rPr>
+        <w:t>Показатели тендерной деятельности также подтверждают наличие проблемы. За 2023-2025 гг. доля отклоненных заявок на этапе допуска сохраняется на уровне около 15%, а всего выявлено 77 случаев отклонений. Наиболее распространенными причинами стали технические ошибки при работе с ЭТП, ошибки, связанные с требованиями законодательства и документации, расчетные неточности и организационные нарушения при подготовке заявки. Значительная часть этих ошибок относится к предотвратимым, то есть может быть снижена за счет обучения, стандартизации процедур, актуализации шаблонов и введения контрольных чек-листов.</w:t>
+      </w:r>
+    </w:p>
+    <w:p>
+      <w:pPr>
+        <w:spacing w:line="360" w:lineRule="auto" w:after="120"/>
+        <w:ind w:firstLine="700"/>
+      </w:pPr>
+      <w:r>
+        <w:rPr>
+          <w:rFonts w:ascii="Times New Roman" w:hAnsi="Times New Roman"/>
+          <w:sz w:val="28"/>
+        </w:rPr>
+        <w:t>Таким образом, по итогам второй главы можно сделать вывод, что проблема ООО «Лайф Медиа» заключается не в отсутствии отдельных обучающих действий, а в отсутствии целостной системы обучения и развития тендерных специалистов. Обучение в компании носит фрагментарный, реактивный и преимущественно неформальный характер. Оно не встроено в систему управления персоналом, не связано с мотивацией и не подкреплено регулярной оценкой результатов. Именно поэтому в третьей главе необходимо разработать комплекс практических мероприятий, направленных на создание единой системы обучения, снижение количества формальных ошибок, повышение качества подготовки заявок и рост эффективности участия компании в тендерах.</w:t>
       </w:r>
     </w:p>
     <w:p>

</xml_diff>